<commit_message>
Permisos: papeleta cubre legal+progresivo en fechas; plantillas centradas/compactas
</commit_message>
<xml_diff>
--- a/papeletas/papeleta_normales.docx
+++ b/papeletas/papeleta_normales.docx
@@ -412,13 +412,14 @@
         </w:trPr>
         <w:tc>
           <w:tcPr>
+            <w:vAlign w:val="center"/>
             <w:tcW w:w="716" w:type="dxa"/>
             <w:vMerge w:val="restart"/>
           </w:tcPr>
           <w:p>
             <w:pPr>
               <w:pStyle w:val="Default"/>
-              <w:spacing w:line="480" w:lineRule="auto"/>
+              <w:spacing w:line="360" w:lineRule="auto"/>
               <w:jc w:val="center"/>
               <w:rPr>
                 <w:sz w:val="14"/>
@@ -434,7 +435,7 @@
           <w:p>
             <w:pPr>
               <w:pStyle w:val="Default"/>
-              <w:spacing w:line="480" w:lineRule="auto"/>
+              <w:spacing w:line="360" w:lineRule="auto"/>
               <w:jc w:val="center"/>
               <w:rPr>
                 <w:sz w:val="14"/>
@@ -450,13 +451,14 @@
         </w:tc>
         <w:tc>
           <w:tcPr>
+            <w:vAlign w:val="center"/>
             <w:tcW w:w="905" w:type="dxa"/>
             <w:vAlign w:val="center"/>
           </w:tcPr>
           <w:p>
             <w:pPr>
               <w:pStyle w:val="Default"/>
-              <w:spacing w:line="480" w:lineRule="auto"/>
+              <w:spacing w:line="360" w:lineRule="auto"/>
               <w:jc w:val="center"/>
               <w:rPr>
                 <w:sz w:val="14"/>
@@ -472,13 +474,14 @@
         </w:tc>
         <w:tc>
           <w:tcPr>
+            <w:vAlign w:val="center"/>
             <w:tcW w:w="859" w:type="dxa"/>
             <w:vAlign w:val="center"/>
           </w:tcPr>
           <w:p>
             <w:pPr>
               <w:pStyle w:val="Default"/>
-              <w:spacing w:line="480" w:lineRule="auto"/>
+              <w:spacing w:line="360" w:lineRule="auto"/>
               <w:jc w:val="center"/>
               <w:rPr>
                 <w:sz w:val="14"/>
@@ -494,13 +497,14 @@
         </w:tc>
         <w:tc>
           <w:tcPr>
+            <w:vAlign w:val="center"/>
             <w:tcW w:w="1014" w:type="dxa"/>
             <w:vAlign w:val="center"/>
           </w:tcPr>
           <w:p>
             <w:pPr>
               <w:pStyle w:val="Default"/>
-              <w:spacing w:line="480" w:lineRule="auto"/>
+              <w:spacing w:line="360" w:lineRule="auto"/>
               <w:jc w:val="center"/>
               <w:rPr>
                 <w:sz w:val="14"/>
@@ -516,6 +520,7 @@
         </w:tc>
         <w:tc>
           <w:tcPr>
+            <w:vAlign w:val="center"/>
             <w:tcW w:w="1733" w:type="dxa"/>
             <w:tcBorders>
               <w:top w:val="nil"/>
@@ -525,7 +530,7 @@
           <w:p>
             <w:pPr>
               <w:pStyle w:val="Default"/>
-              <w:spacing w:line="480" w:lineRule="auto"/>
+              <w:spacing w:line="360" w:lineRule="auto"/>
               <w:jc w:val="center"/>
               <w:rPr>
                 <w:sz w:val="14"/>
@@ -535,13 +540,14 @@
         </w:tc>
         <w:tc>
           <w:tcPr>
+            <w:vAlign w:val="center"/>
             <w:tcW w:w="1077" w:type="dxa"/>
             <w:vMerge w:val="restart"/>
           </w:tcPr>
           <w:p>
             <w:pPr>
               <w:pStyle w:val="Default"/>
-              <w:spacing w:line="480" w:lineRule="auto"/>
+              <w:spacing w:line="360" w:lineRule="auto"/>
               <w:jc w:val="center"/>
               <w:rPr>
                 <w:sz w:val="14"/>
@@ -557,7 +563,7 @@
           <w:p>
             <w:pPr>
               <w:pStyle w:val="Default"/>
-              <w:spacing w:line="480" w:lineRule="auto"/>
+              <w:spacing w:line="360" w:lineRule="auto"/>
               <w:jc w:val="center"/>
               <w:rPr>
                 <w:sz w:val="14"/>
@@ -573,13 +579,14 @@
         </w:tc>
         <w:tc>
           <w:tcPr>
+            <w:vAlign w:val="center"/>
             <w:tcW w:w="854" w:type="dxa"/>
             <w:vAlign w:val="center"/>
           </w:tcPr>
           <w:p>
             <w:pPr>
               <w:pStyle w:val="Default"/>
-              <w:spacing w:line="480" w:lineRule="auto"/>
+              <w:spacing w:line="360" w:lineRule="auto"/>
               <w:jc w:val="center"/>
               <w:rPr>
                 <w:sz w:val="14"/>
@@ -595,13 +602,14 @@
         </w:tc>
         <w:tc>
           <w:tcPr>
+            <w:vAlign w:val="center"/>
             <w:tcW w:w="851" w:type="dxa"/>
             <w:vAlign w:val="center"/>
           </w:tcPr>
           <w:p>
             <w:pPr>
               <w:pStyle w:val="Default"/>
-              <w:spacing w:line="480" w:lineRule="auto"/>
+              <w:spacing w:line="360" w:lineRule="auto"/>
               <w:jc w:val="center"/>
               <w:rPr>
                 <w:sz w:val="14"/>
@@ -617,13 +625,14 @@
         </w:tc>
         <w:tc>
           <w:tcPr>
+            <w:vAlign w:val="center"/>
             <w:tcW w:w="932" w:type="dxa"/>
             <w:vAlign w:val="center"/>
           </w:tcPr>
           <w:p>
             <w:pPr>
               <w:pStyle w:val="Default"/>
-              <w:spacing w:line="480" w:lineRule="auto"/>
+              <w:spacing w:line="360" w:lineRule="auto"/>
               <w:jc w:val="center"/>
               <w:rPr>
                 <w:sz w:val="14"/>
@@ -644,13 +653,14 @@
         </w:trPr>
         <w:tc>
           <w:tcPr>
+            <w:vAlign w:val="center"/>
             <w:tcW w:w="716" w:type="dxa"/>
             <w:vMerge/>
           </w:tcPr>
           <w:p>
             <w:pPr>
               <w:pStyle w:val="Default"/>
-              <w:spacing w:line="480" w:lineRule="auto"/>
+              <w:spacing w:line="360" w:lineRule="auto"/>
               <w:jc w:val="center"/>
               <w:rPr>
                 <w:sz w:val="14"/>
@@ -660,6 +670,7 @@
         </w:tc>
         <w:tc>
           <w:tcPr>
+            <w:vAlign w:val="center"/>
             <w:tcW w:w="905" w:type="dxa"/>
           </w:tcPr>
           <w:p>
@@ -685,12 +696,13 @@
         </w:tc>
         <w:tc>
           <w:tcPr>
+            <w:vAlign w:val="center"/>
             <w:tcW w:w="859" w:type="dxa"/>
           </w:tcPr>
           <w:p>
             <w:pPr>
               <w:pStyle w:val="Default"/>
-              <w:spacing w:line="480" w:lineRule="auto"/>
+              <w:spacing w:line="360" w:lineRule="auto"/>
               <w:jc w:val="center"/>
               <w:rPr>
                 <w:b/>
@@ -710,12 +722,13 @@
         </w:tc>
         <w:tc>
           <w:tcPr>
+            <w:vAlign w:val="center"/>
             <w:tcW w:w="1014" w:type="dxa"/>
           </w:tcPr>
           <w:p>
             <w:pPr>
               <w:pStyle w:val="Default"/>
-              <w:spacing w:line="480" w:lineRule="auto"/>
+              <w:spacing w:line="360" w:lineRule="auto"/>
               <w:jc w:val="center"/>
               <w:rPr>
                 <w:b/>
@@ -735,6 +748,7 @@
         </w:tc>
         <w:tc>
           <w:tcPr>
+            <w:vAlign w:val="center"/>
             <w:tcW w:w="1733" w:type="dxa"/>
             <w:tcBorders>
               <w:top w:val="nil"/>
@@ -744,7 +758,7 @@
           <w:p>
             <w:pPr>
               <w:pStyle w:val="Default"/>
-              <w:spacing w:line="480" w:lineRule="auto"/>
+              <w:spacing w:line="360" w:lineRule="auto"/>
               <w:jc w:val="center"/>
               <w:rPr>
                 <w:sz w:val="14"/>
@@ -754,13 +768,14 @@
         </w:tc>
         <w:tc>
           <w:tcPr>
+            <w:vAlign w:val="center"/>
             <w:tcW w:w="1077" w:type="dxa"/>
             <w:vMerge/>
           </w:tcPr>
           <w:p>
             <w:pPr>
               <w:pStyle w:val="Default"/>
-              <w:spacing w:line="480" w:lineRule="auto"/>
+              <w:spacing w:line="360" w:lineRule="auto"/>
               <w:jc w:val="center"/>
               <w:rPr>
                 <w:sz w:val="14"/>
@@ -770,12 +785,13 @@
         </w:tc>
         <w:tc>
           <w:tcPr>
+            <w:vAlign w:val="center"/>
             <w:tcW w:w="854" w:type="dxa"/>
           </w:tcPr>
           <w:p>
             <w:pPr>
               <w:pStyle w:val="Default"/>
-              <w:spacing w:line="480" w:lineRule="auto"/>
+              <w:spacing w:line="360" w:lineRule="auto"/>
               <w:jc w:val="center"/>
               <w:rPr>
                 <w:b/>
@@ -795,12 +811,13 @@
         </w:tc>
         <w:tc>
           <w:tcPr>
+            <w:vAlign w:val="center"/>
             <w:tcW w:w="851" w:type="dxa"/>
           </w:tcPr>
           <w:p>
             <w:pPr>
               <w:pStyle w:val="Default"/>
-              <w:spacing w:line="480" w:lineRule="auto"/>
+              <w:spacing w:line="360" w:lineRule="auto"/>
               <w:jc w:val="center"/>
               <w:rPr>
                 <w:b/>
@@ -820,12 +837,13 @@
         </w:tc>
         <w:tc>
           <w:tcPr>
+            <w:vAlign w:val="center"/>
             <w:tcW w:w="932" w:type="dxa"/>
           </w:tcPr>
           <w:p>
             <w:pPr>
               <w:pStyle w:val="Default"/>
-              <w:spacing w:line="480" w:lineRule="auto"/>
+              <w:spacing w:line="360" w:lineRule="auto"/>
               <w:jc w:val="center"/>
               <w:rPr>
                 <w:b/>
@@ -1841,6 +1859,7 @@
         </w:trPr>
         <w:tc>
           <w:tcPr>
+            <w:vAlign w:val="center"/>
             <w:tcW w:w="2810" w:type="dxa"/>
             <w:tcBorders>
               <w:top w:val="single" w:sz="6" w:space="0" w:color="auto"/>
@@ -1861,6 +1880,7 @@
         </w:tc>
         <w:tc>
           <w:tcPr>
+            <w:vAlign w:val="center"/>
             <w:tcW w:w="236" w:type="dxa"/>
             <w:tcBorders>
               <w:left w:val="single" w:sz="6" w:space="0" w:color="auto"/>
@@ -1879,6 +1899,7 @@
         </w:tc>
         <w:tc>
           <w:tcPr>
+            <w:vAlign w:val="center"/>
             <w:tcW w:w="3261" w:type="dxa"/>
             <w:tcBorders>
               <w:top w:val="single" w:sz="8" w:space="0" w:color="auto"/>
@@ -1899,6 +1920,7 @@
         </w:tc>
         <w:tc>
           <w:tcPr>
+            <w:vAlign w:val="center"/>
             <w:tcW w:w="283" w:type="dxa"/>
             <w:tcBorders>
               <w:left w:val="single" w:sz="8" w:space="0" w:color="auto"/>
@@ -1917,6 +1939,7 @@
         </w:tc>
         <w:tc>
           <w:tcPr>
+            <w:vAlign w:val="center"/>
             <w:tcW w:w="2977" w:type="dxa"/>
             <w:tcBorders>
               <w:top w:val="single" w:sz="8" w:space="0" w:color="auto"/>
@@ -1942,6 +1965,7 @@
         </w:trPr>
         <w:tc>
           <w:tcPr>
+            <w:vAlign w:val="center"/>
             <w:tcW w:w="2810" w:type="dxa"/>
             <w:tcBorders>
               <w:top w:val="single" w:sz="12" w:space="0" w:color="auto"/>
@@ -1991,6 +2015,7 @@
         </w:tc>
         <w:tc>
           <w:tcPr>
+            <w:vAlign w:val="center"/>
             <w:tcW w:w="236" w:type="dxa"/>
             <w:tcBorders>
               <w:left w:val="single" w:sz="6" w:space="0" w:color="auto"/>
@@ -2011,6 +2036,7 @@
         </w:tc>
         <w:tc>
           <w:tcPr>
+            <w:vAlign w:val="center"/>
             <w:tcW w:w="3261" w:type="dxa"/>
             <w:tcBorders>
               <w:top w:val="single" w:sz="12" w:space="0" w:color="auto"/>
@@ -2060,6 +2086,7 @@
         </w:tc>
         <w:tc>
           <w:tcPr>
+            <w:vAlign w:val="center"/>
             <w:tcW w:w="283" w:type="dxa"/>
             <w:tcBorders>
               <w:left w:val="single" w:sz="8" w:space="0" w:color="auto"/>
@@ -2080,6 +2107,7 @@
         </w:tc>
         <w:tc>
           <w:tcPr>
+            <w:vAlign w:val="center"/>
             <w:tcW w:w="2977" w:type="dxa"/>
             <w:tcBorders>
               <w:top w:val="single" w:sz="12" w:space="0" w:color="auto"/>
@@ -2161,7 +2189,7 @@
     </w:p>
     <w:sectPr>
       <w:pgSz w:w="11906" w:h="16838" w:code="9"/>
-      <w:pgMar w:top="720" w:right="720" w:bottom="720" w:left="720" w:header="720" w:footer="720" w:gutter="0"/>
+      <w:pgMar w:top="567" w:right="567" w:bottom="567" w:left="567" w:header="567" w:footer="567" w:gutter="0"/>
       <w:cols w:space="720"/>
       <w:noEndnote/>
       <w:docGrid w:linePitch="299"/>

</xml_diff>